<commit_message>
Added more details to reporting user stories and updated priority list
</commit_message>
<xml_diff>
--- a/Priority List.docx
+++ b/Priority List.docx
@@ -13,6 +13,25 @@
           <w:lang w:val="en-US"/>
         </w:rPr>
         <w:t>Priority List</w:t>
+      </w:r>
+      <w:r>
+        <w:rPr>
+          <w:lang w:val="en-US"/>
+        </w:rPr>
+        <w:t xml:space="preserve"> </w:t>
+      </w:r>
+    </w:p>
+    <w:p>
+      <w:pPr>
+        <w:rPr>
+          <w:lang w:val="en-US"/>
+        </w:rPr>
+      </w:pPr>
+      <w:r>
+        <w:rPr>
+          <w:lang w:val="en-US"/>
+        </w:rPr>
+        <w:t>Made by Fathiat Ayodele Team 12 System Analyst/Designer</w:t>
       </w:r>
     </w:p>
     <w:tbl>
@@ -207,67 +226,17 @@
               </w:rPr>
             </w:pPr>
           </w:p>
-          <w:tbl>
-            <w:tblPr>
-              <w:tblW w:w="0" w:type="auto"/>
-              <w:tblCellSpacing w:w="15" w:type="dxa"/>
-              <w:tblCellMar>
-                <w:top w:w="15" w:type="dxa"/>
-                <w:left w:w="15" w:type="dxa"/>
-                <w:bottom w:w="15" w:type="dxa"/>
-                <w:right w:w="15" w:type="dxa"/>
-              </w:tblCellMar>
-              <w:tblLook w:val="04A0" w:firstRow="1" w:lastRow="0" w:firstColumn="1" w:lastColumn="0" w:noHBand="0" w:noVBand="1"/>
-            </w:tblPr>
-            <w:tblGrid>
-              <w:gridCol w:w="96"/>
-            </w:tblGrid>
-            <w:tr>
-              <w:trPr>
-                <w:tblCellSpacing w:w="15" w:type="dxa"/>
-              </w:trPr>
-              <w:tc>
-                <w:tcPr>
-                  <w:tcW w:w="0" w:type="auto"/>
-                  <w:vAlign w:val="center"/>
-                  <w:hideMark/>
-                </w:tcPr>
-                <w:p>
-                  <w:pPr>
-                    <w:spacing w:after="0" w:line="240" w:lineRule="auto"/>
-                    <w:rPr>
-                      <w:lang w:val="nl-NL"/>
-                    </w:rPr>
-                  </w:pPr>
-                </w:p>
-              </w:tc>
-            </w:tr>
-          </w:tbl>
           <w:p>
             <w:pPr>
               <w:rPr>
                 <w:lang w:val="nl-NL"/>
               </w:rPr>
             </w:pPr>
-            <w:proofErr w:type="spellStart"/>
             <w:r>
               <w:rPr>
                 <w:lang w:val="nl-NL"/>
               </w:rPr>
-              <w:t>Send</w:t>
-            </w:r>
-            <w:proofErr w:type="spellEnd"/>
-            <w:r>
-              <w:rPr>
-                <w:lang w:val="nl-NL"/>
-              </w:rPr>
-              <w:t xml:space="preserve"> login details via em</w:t>
-            </w:r>
-            <w:r>
-              <w:rPr>
-                <w:lang w:val="nl-NL"/>
-              </w:rPr>
-              <w:t>ail</w:t>
+              <w:t>Send login details via email</w:t>
             </w:r>
           </w:p>
         </w:tc>
@@ -374,15 +343,7 @@
           </w:tcPr>
           <w:p>
             <w:r>
-              <w:t xml:space="preserve">Commercial users must be able to submit company and director details so that their eligibility can be assessed by </w:t>
-            </w:r>
-            <w:proofErr w:type="spellStart"/>
-            <w:r>
-              <w:t>InfoPharma</w:t>
-            </w:r>
-            <w:proofErr w:type="spellEnd"/>
-            <w:r>
-              <w:t xml:space="preserve"> staff.</w:t>
+              <w:t>Commercial users must be able to submit company and director details so that their eligibility can be assessed by InfoPharma staff.</w:t>
             </w:r>
           </w:p>
         </w:tc>
@@ -656,7 +617,11 @@
               <w:t xml:space="preserve"> </w:t>
             </w:r>
             <w:r>
-              <w:t>user desktop environment, but the system could still function without strict enforcement.</w:t>
+              <w:t xml:space="preserve">user desktop environment, </w:t>
+            </w:r>
+            <w:r>
+              <w:lastRenderedPageBreak/>
+              <w:t>but the system could still function without strict enforcement.</w:t>
             </w:r>
           </w:p>
         </w:tc>
@@ -889,10 +854,10 @@
           </w:tcPr>
           <w:p>
             <w:r>
-              <w:t>Pro</w:t>
-            </w:r>
-            <w:r>
-              <w:t>pagate successful orders to IPOS-CA</w:t>
+              <w:t>Submit</w:t>
+            </w:r>
+            <w:r>
+              <w:t xml:space="preserve"> successful orders to IPOS-CA</w:t>
             </w:r>
           </w:p>
         </w:tc>
@@ -976,16 +941,13 @@
           </w:tcPr>
           <w:p>
             <w:r>
-              <w:t>Apply 10% discount on every 10</w:t>
-            </w:r>
-            <w:r>
-              <w:rPr>
-                <w:vertAlign w:val="superscript"/>
-              </w:rPr>
-              <w:t>th</w:t>
-            </w:r>
-            <w:r>
-              <w:t xml:space="preserve"> order</w:t>
+              <w:t>Apply</w:t>
+            </w:r>
+            <w:r>
+              <w:t xml:space="preserve"> loyalty</w:t>
+            </w:r>
+            <w:r>
+              <w:t xml:space="preserve"> discount </w:t>
             </w:r>
           </w:p>
         </w:tc>
@@ -1233,6 +1195,7 @@
           </w:tcPr>
           <w:p>
             <w:r>
+              <w:lastRenderedPageBreak/>
               <w:t>24</w:t>
             </w:r>
           </w:p>
@@ -1275,7 +1238,6 @@
           </w:tcPr>
           <w:p>
             <w:r>
-              <w:lastRenderedPageBreak/>
               <w:t>25</w:t>
             </w:r>
           </w:p>
@@ -1370,7 +1332,10 @@
           </w:tcPr>
           <w:p>
             <w:r>
-              <w:t>Track promotional items added to basket and purchased</w:t>
+              <w:t xml:space="preserve">Track promotional </w:t>
+            </w:r>
+            <w:r>
+              <w:t>purchased items</w:t>
             </w:r>
           </w:p>
         </w:tc>
@@ -1391,6 +1356,195 @@
           <w:p>
             <w:r>
               <w:t>These counters are necessary to calculate conversion rates and evaluate the success of promotional campaigns.</w:t>
+            </w:r>
+          </w:p>
+        </w:tc>
+      </w:tr>
+      <w:tr>
+        <w:tc>
+          <w:tcPr>
+            <w:tcW w:w="704" w:type="dxa"/>
+          </w:tcPr>
+          <w:p>
+            <w:r>
+              <w:t>28</w:t>
+            </w:r>
+          </w:p>
+        </w:tc>
+        <w:tc>
+          <w:tcPr>
+            <w:tcW w:w="2552" w:type="dxa"/>
+          </w:tcPr>
+          <w:p>
+            <w:r>
+              <w:t>Generate sales report</w:t>
+            </w:r>
+          </w:p>
+        </w:tc>
+        <w:tc>
+          <w:tcPr>
+            <w:tcW w:w="1417" w:type="dxa"/>
+          </w:tcPr>
+          <w:p>
+            <w:r>
+              <w:t>Essential</w:t>
+            </w:r>
+          </w:p>
+        </w:tc>
+        <w:tc>
+          <w:tcPr>
+            <w:tcW w:w="4343" w:type="dxa"/>
+          </w:tcPr>
+          <w:p>
+            <w:r>
+              <w:t xml:space="preserve">A sales report </w:t>
+            </w:r>
+            <w:r>
+              <w:t>is explicitly required in the IPO-PU specification.</w:t>
+            </w:r>
+          </w:p>
+        </w:tc>
+      </w:tr>
+      <w:tr>
+        <w:tc>
+          <w:tcPr>
+            <w:tcW w:w="704" w:type="dxa"/>
+          </w:tcPr>
+          <w:p>
+            <w:r>
+              <w:t>29</w:t>
+            </w:r>
+          </w:p>
+        </w:tc>
+        <w:tc>
+          <w:tcPr>
+            <w:tcW w:w="2552" w:type="dxa"/>
+          </w:tcPr>
+          <w:p>
+            <w:r>
+              <w:t>Generate campaign report</w:t>
+            </w:r>
+          </w:p>
+        </w:tc>
+        <w:tc>
+          <w:tcPr>
+            <w:tcW w:w="1417" w:type="dxa"/>
+          </w:tcPr>
+          <w:p>
+            <w:r>
+              <w:t>Essential</w:t>
+            </w:r>
+          </w:p>
+        </w:tc>
+        <w:tc>
+          <w:tcPr>
+            <w:tcW w:w="4343" w:type="dxa"/>
+          </w:tcPr>
+          <w:p>
+            <w:r>
+              <w:t>E</w:t>
+            </w:r>
+            <w:r>
+              <w:t>ssential to analysing the effectiveness of a campaign.</w:t>
+            </w:r>
+          </w:p>
+        </w:tc>
+      </w:tr>
+      <w:tr>
+        <w:tc>
+          <w:tcPr>
+            <w:tcW w:w="704" w:type="dxa"/>
+          </w:tcPr>
+          <w:p>
+            <w:r>
+              <w:t>30</w:t>
+            </w:r>
+          </w:p>
+        </w:tc>
+        <w:tc>
+          <w:tcPr>
+            <w:tcW w:w="2552" w:type="dxa"/>
+          </w:tcPr>
+          <w:p>
+            <w:r>
+              <w:t>Generate campaign hits</w:t>
+            </w:r>
+          </w:p>
+        </w:tc>
+        <w:tc>
+          <w:tcPr>
+            <w:tcW w:w="1417" w:type="dxa"/>
+          </w:tcPr>
+          <w:p>
+            <w:r>
+              <w:t>Essential</w:t>
+            </w:r>
+          </w:p>
+        </w:tc>
+        <w:tc>
+          <w:tcPr>
+            <w:tcW w:w="4343" w:type="dxa"/>
+          </w:tcPr>
+          <w:p>
+            <w:r>
+              <w:t xml:space="preserve">The </w:t>
+            </w:r>
+            <w:r>
+              <w:t xml:space="preserve">tracking </w:t>
+            </w:r>
+            <w:r>
+              <w:t>conversion would be incomplete without tracking the hits of goods withing campaigns.</w:t>
+            </w:r>
+          </w:p>
+        </w:tc>
+      </w:tr>
+      <w:tr>
+        <w:tc>
+          <w:tcPr>
+            <w:tcW w:w="704" w:type="dxa"/>
+          </w:tcPr>
+          <w:p>
+            <w:r>
+              <w:t>31</w:t>
+            </w:r>
+          </w:p>
+        </w:tc>
+        <w:tc>
+          <w:tcPr>
+            <w:tcW w:w="2552" w:type="dxa"/>
+          </w:tcPr>
+          <w:p>
+            <w:r>
+              <w:t xml:space="preserve">Cancel </w:t>
+            </w:r>
+            <w:r>
+              <w:t>campaign</w:t>
+            </w:r>
+          </w:p>
+        </w:tc>
+        <w:tc>
+          <w:tcPr>
+            <w:tcW w:w="1417" w:type="dxa"/>
+          </w:tcPr>
+          <w:p>
+            <w:r>
+              <w:t>Important</w:t>
+            </w:r>
+          </w:p>
+        </w:tc>
+        <w:tc>
+          <w:tcPr>
+            <w:tcW w:w="4343" w:type="dxa"/>
+          </w:tcPr>
+          <w:p>
+            <w:r>
+              <w:t>The campaign needs to be ab</w:t>
+            </w:r>
+            <w:r>
+              <w:t>le to be cancelled manually by an admin but  it is</w:t>
+            </w:r>
+            <w:r>
+              <w:t>n’t essential as the campaign already has an end date.</w:t>
             </w:r>
           </w:p>
         </w:tc>
@@ -2010,6 +2164,7 @@
   <w:style w:type="character" w:default="1" w:styleId="DefaultParagraphFont">
     <w:name w:val="Default Paragraph Font"/>
     <w:uiPriority w:val="1"/>
+    <w:semiHidden/>
     <w:unhideWhenUsed/>
   </w:style>
   <w:style w:type="table" w:default="1" w:styleId="TableNormal">

</xml_diff>